<commit_message>
Add institution logo to paper cover page
Co-Authored-By: Claude Opus 5 <noreply@anthropic.com>
Claude-Session: https://claude.ai/code/session_01XMxbVW1mQoeJZiQuhYdABE
</commit_message>
<xml_diff>
--- a/מטלה אישית - אבחון והתערבות - תיכון דרכא מקסים לוי לוד.docx
+++ b/מטלה אישית - אבחון והתערבות - תיכון דרכא מקסים לוי לוד.docx
@@ -4,8 +4,54 @@
   <w:body>
     <w:p>
       <w:pPr>
-        <w:spacing w:after="360"/>
+        <w:spacing w:after="200"/>
       </w:pPr>
+    </w:p>
+    <w:p>
+      <w:pPr>
+        <w:spacing w:after="140"/>
+        <w:jc w:val="center"/>
+      </w:pPr>
+      <w:r>
+        <w:drawing>
+          <wp:inline distT="0" distB="0" distL="0" distR="0">
+            <wp:extent cx="1000125" cy="1000125"/>
+            <wp:effectExtent t="0" r="0" b="0" l="0"/>
+            <wp:docPr id="1" name="" descr="" title=""/>
+            <wp:cNvGraphicFramePr>
+              <a:graphicFrameLocks xmlns:a="http://schemas.openxmlformats.org/drawingml/2006/main" noChangeAspect="1"/>
+            </wp:cNvGraphicFramePr>
+            <a:graphic xmlns:a="http://schemas.openxmlformats.org/drawingml/2006/main">
+              <a:graphicData uri="http://schemas.openxmlformats.org/drawingml/2006/picture">
+                <pic:pic xmlns:pic="http://schemas.openxmlformats.org/drawingml/2006/picture">
+                  <pic:nvPicPr>
+                    <pic:cNvPr id="0" name="" descr=""/>
+                    <pic:cNvPicPr>
+                      <a:picLocks noChangeAspect="1" noChangeArrowheads="1"/>
+                    </pic:cNvPicPr>
+                  </pic:nvPicPr>
+                  <pic:blipFill>
+                    <a:blip r:embed="rId7" cstate="none"/>
+                    <a:srcRect/>
+                    <a:stretch>
+                      <a:fillRect/>
+                    </a:stretch>
+                  </pic:blipFill>
+                  <pic:spPr bwMode="auto">
+                    <a:xfrm>
+                      <a:off x="0" y="0"/>
+                      <a:ext cx="1000125" cy="1000125"/>
+                    </a:xfrm>
+                    <a:prstGeom prst="rect">
+                      <a:avLst/>
+                    </a:prstGeom>
+                  </pic:spPr>
+                </pic:pic>
+              </a:graphicData>
+            </a:graphic>
+          </wp:inline>
+        </w:drawing>
+      </w:r>
     </w:p>
     <w:p>
       <w:pPr>
@@ -931,7 +977,7 @@
                     </pic:cNvPicPr>
                   </pic:nvPicPr>
                   <pic:blipFill>
-                    <a:blip r:embed="rId7" cstate="none"/>
+                    <a:blip r:embed="rId8" cstate="none"/>
                     <a:srcRect/>
                     <a:stretch>
                       <a:fillRect/>

</xml_diff>

<commit_message>
Enlarge fishbone diagram onto a dedicated landscape page
Co-Authored-By: Claude Opus 5 <noreply@anthropic.com>
Claude-Session: https://claude.ai/code/session_01XMxbVW1mQoeJZiQuhYdABE
</commit_message>
<xml_diff>
--- a/מטלה אישית - אבחון והתערבות - תיכון דרכא מקסים לוי לוד.docx
+++ b/מטלה אישית - אבחון והתערבות - תיכון דרכא מקסים לוי לוד.docx
@@ -955,13 +955,23 @@
     </w:p>
     <w:p>
       <w:pPr>
-        <w:spacing w:after="60" w:before="120"/>
+        <w:sectPr>
+          <w:pgSz w:w="11906" w:h="16838" w:orient="portrait"/>
+          <w:pgMar w:top="1418" w:right="1418" w:bottom="1418" w:left="1418" w:header="708" w:footer="708" w:gutter="0"/>
+          <w:pgNumType/>
+          <w:docGrid w:linePitch="360"/>
+        </w:sectPr>
+      </w:pPr>
+    </w:p>
+    <w:p>
+      <w:pPr>
+        <w:spacing w:after="40" w:before="0"/>
         <w:jc w:val="center"/>
       </w:pPr>
       <w:r>
         <w:drawing>
           <wp:inline distT="0" distB="0" distL="0" distR="0">
-            <wp:extent cx="5715000" cy="1876425"/>
+            <wp:extent cx="9429750" cy="6286500"/>
             <wp:effectExtent t="0" r="0" b="0" l="0"/>
             <wp:docPr id="1" name="" descr="" title=""/>
             <wp:cNvGraphicFramePr>
@@ -986,7 +996,7 @@
                   <pic:spPr bwMode="auto">
                     <a:xfrm>
                       <a:off x="0" y="0"/>
-                      <a:ext cx="5715000" cy="1876425"/>
+                      <a:ext cx="9429750" cy="6286500"/>
                     </a:xfrm>
                     <a:prstGeom prst="rect">
                       <a:avLst/>
@@ -1002,7 +1012,7 @@
     <w:p>
       <w:pPr>
         <w:bidi/>
-        <w:spacing w:after="200"/>
+        <w:spacing w:after="0"/>
         <w:jc w:val="center"/>
       </w:pPr>
       <w:r>
@@ -1011,13 +1021,23 @@
           <w:b/>
           <w:bCs/>
           <w:noProof/>
-          <w:sz w:val="20"/>
-          <w:szCs w:val="20"/>
+          <w:sz w:val="22"/>
+          <w:szCs w:val="22"/>
           <w:rtl/>
           <w:lang w:bidi="he-IL"/>
         </w:rPr>
         <w:t xml:space="preserve">תרשים 1: ניתוח סיבות שורש לפי מודל אישיקאווה</w:t>
       </w:r>
+    </w:p>
+    <w:p>
+      <w:pPr>
+        <w:sectPr>
+          <w:pgSz w:w="16838" w:h="11906" w:orient="landscape"/>
+          <w:pgMar w:top="720" w:right="720" w:bottom="720" w:left="720" w:header="708" w:footer="708" w:gutter="0"/>
+          <w:pgNumType/>
+          <w:docGrid w:linePitch="360"/>
+        </w:sectPr>
+      </w:pPr>
     </w:p>
     <w:p>
       <w:pPr>

</xml_diff>

<commit_message>
Fix reversed Hebrew text in fishbone diagram
Pillow's Raqm layout engine already applies the bidi algorithm, so the
manual string reversal was double-reversing every label. Pass strings
as-is with direction='rtl', and auto-crop the canvas.

Co-Authored-By: Claude Opus 5 <noreply@anthropic.com>
Claude-Session: https://claude.ai/code/session_01XMxbVW1mQoeJZiQuhYdABE
</commit_message>
<xml_diff>
--- a/מטלה אישית - אבחון והתערבות - תיכון דרכא מקסים לוי לוד.docx
+++ b/מטלה אישית - אבחון והתערבות - תיכון דרכא מקסים לוי לוד.docx
@@ -971,7 +971,7 @@
       <w:r>
         <w:drawing>
           <wp:inline distT="0" distB="0" distL="0" distR="0">
-            <wp:extent cx="9429750" cy="6286500"/>
+            <wp:extent cx="9620250" cy="5419725"/>
             <wp:effectExtent t="0" r="0" b="0" l="0"/>
             <wp:docPr id="1" name="" descr="" title=""/>
             <wp:cNvGraphicFramePr>
@@ -996,7 +996,7 @@
                   <pic:spPr bwMode="auto">
                     <a:xfrm>
                       <a:off x="0" y="0"/>
-                      <a:ext cx="9429750" cy="6286500"/>
+                      <a:ext cx="9620250" cy="5419725"/>
                     </a:xfrm>
                     <a:prstGeom prst="rect">
                       <a:avLst/>

</xml_diff>